<commit_message>
docs: refine model semantics and architecture review
</commit_message>
<xml_diff>
--- a/docs/UniverseModel_Design.docx
+++ b/docs/UniverseModel_Design.docx
@@ -2079,6 +2079,11 @@
       </w:r>
     </w:p>
     <w:p>
+      <w:r>
+        <w:t>本轮补充审视见 docs/architecture/design_review.md：区分接口冻结前的 P0、对应场景报告前的 P1，以及由决策敏感性触发的 P2。专题覆盖请求/缓冲生命周期、模型组合、完整工作量、实验有效性与物理可行性；这些能力继续归属现有 13 个模块。</w:t>
+      </w:r>
+    </w:p>
+    <w:p>
       <w:pPr>
         <w:pStyle w:val="Heading1"/>
         <w:pageBreakBefore/>
@@ -2679,6 +2684,11 @@
       </w:r>
     </w:p>
     <w:p>
+      <w:r>
+        <w:t>操作能力同时约束 shape、dtype、累加精度、layout、alignment 和稀疏格式。unsupported、infeasible、missing_characterization 与 out_of_domain 分别诊断；回退执行必须显式产生放置、转换和搬运成本。模型覆盖与成本归属见 docs/architecture/model_composition.md。</w:t>
+      </w:r>
+    </w:p>
+    <w:p>
       <w:pPr>
         <w:pStyle w:val="Heading2"/>
       </w:pPr>
@@ -2704,6 +2714,11 @@
     <w:p>
       <w:r>
         <w:t>大数据经引用交换；数据内容保存由 artifacts/storage 处理，目标内存有效性由硬件/运行时协议维护。未建模一致性的配置不得默认提供全局共享内存语义。</w:t>
+      </w:r>
+    </w:p>
+    <w:p>
+      <w:r>
+        <w:t>DataRef 还需引用有效的分配身份或世代；相同地址重新分配后，旧引用不得继续生效。逻辑有效字节、实际分配字节、存储访问字节和链路字节采用独立口径，不能由同一个张量大小字段替代。</w:t>
       </w:r>
     </w:p>
     <w:p>
@@ -3087,7 +3102,12 @@
     </w:p>
     <w:p>
       <w:r>
-        <w:t>操作状态为 submitted → ready → started → completed，任一未完成状态可转 failed/cancelled。submitted 表示进入软件或硬件队列；ready 表示依赖满足；started 表示取得必要资源；completed 表示规定的数据和同步效果已可观察。接收确认不等于完成。</w:t>
+        <w:t>操作状态为 submitted → ready → started → completed；失败转 failed，取消需经过模型声明的处理过程。submitted 表示进入软件或硬件队列；ready 表示依赖满足；started 表示取得必要资源；completed 表示规定的数据和同步效果已可观察。accepted、source_consumed、delivered 与 destination_visible 分别声明；接收确认不等于完成或源缓冲可复用。</w:t>
+      </w:r>
+    </w:p>
+    <w:p>
+      <w:r>
+        <w:t>cancel_requested 不等于 cancelled。已开始操作可拒绝取消、在安全边界停止或排空；已发生的写入、流量和能量不会自动撤销。终态前明确后续效果与资源释放，复位通过 run_epoch 隔离残留事件。请求重试、分配世代和分块可见性见 docs/interfaces/resource_lifecycle.md。</w:t>
       </w:r>
     </w:p>
     <w:p>
@@ -3097,7 +3117,7 @@
     </w:p>
     <w:p>
       <w:r>
-        <w:t>simulator 管理统一时间与稳定事件排序，组件维护局部状态。相同时间的处理顺序固定，例如完成/释放 → 可见性与依赖更新 → 策略回调 → 仲裁发射。顺序及同时间级联事件的终止规则必须版本化；禁止向过去插入事件。</w:t>
+        <w:t>simulator 管理统一时间与稳定事件排序，组件维护局部状态。相同时间按 delta round 与固定阶段处理，例如完成/释放 → 可见性与依赖更新 → 策略回调 → 仲裁发射。新事件需返回更早阶段时进入下一轮；顺序及无进展检测须版本化。资源仲裁另行声明公平/优先级策略，不能由稳定 ID 排序代替。</w:t>
       </w:r>
     </w:p>
     <w:p>
@@ -3144,6 +3164,11 @@
     <w:p>
       <w:r>
         <w:t>SimulationResult 区分 succeeded、failed、cancelled，保留部分统计的有效区间。所有必需操作完成且输出达到规定可见性才可成功。仍有工作却无可推进事件时输出死锁/无进展诊断；事件上限、目标时间上限、宿主墙钟超时分别记录。</w:t>
+      </w:r>
+    </w:p>
+    <w:p>
+      <w:r>
+        <w:t>执行状态、功能验证、模型覆盖和校准适用域分别保存。性能运行未计算完整张量时，不能把执行成功标为功能通过；unknown 成本不能当零累计为完整总成本。初始状态、测量窗口、到达过程与随机子流绑定运行身份，具体比较规则见 docs/methods/experiment_validity.md。</w:t>
       </w:r>
     </w:p>
     <w:p>

</xml_diff>